<commit_message>
fix: given deliverable rubric in prompt
</commit_message>
<xml_diff>
--- a/output/Coding_Standards.docx
+++ b/output/Coding_Standards.docx
@@ -10,7 +10,7 @@
         <w:rPr>
           <w:sz w:val="22"/>
         </w:rPr>
-        <w:t>Coding Standards for Accelerated Software Delivery</w:t>
+        <w:t>Engineering Coding Standards</w:t>
       </w:r>
     </w:p>
     <w:p>
@@ -18,7 +18,7 @@
         <w:rPr>
           <w:sz w:val="20"/>
         </w:rPr>
-        <w:t>This document outlines the coding standards for our software teams, designed to enhance delivery speed, ensure consistency, and reduce friction during code reviews. Currently, pull request reviews often rely on individual opinions due to a lack of documented guidelines, leading to delays and inconsistencies. By establishing clear, objective standards, we aim to streamline development, improve code quality, and foster a more collaborative environment. These standards are tailored to our tech stack, including TypeScript, Node.js, React, Next.js, Neon-hosted PostgreSQL, Drizzle ORM, Prettier, and a monorepo structure. Adherence to these guidelines is crucial for achieving our collective goals of efficient and high-quality software delivery.</w:t>
+        <w:t>Authoritative coding standards for our product agency, reducing PR friction and enhancing code quality. Standards roll out in stages after VP of Engineering review, serving as a living document maintained by the team. Version: 1.0.0Date: 2023-10-27</w:t>
       </w:r>
     </w:p>
     <w:p>
@@ -27,9 +27,9 @@
       </w:pPr>
       <w:r>
         <w:rPr>
-          <w:sz w:val="20"/>
+          <w:sz w:val="22"/>
         </w:rPr>
-        <w:t>General Coding Principles</w:t>
+        <w:t>Purpose and Scope</w:t>
       </w:r>
     </w:p>
     <w:p>
@@ -37,7 +37,18 @@
         <w:rPr>
           <w:sz w:val="20"/>
         </w:rPr>
-        <w:t>Our core principles emphasize maintainability, readability, security, and performance across all projects. Code must be robust and resilient.</w:t>
+        <w:t>Framework for code development, streamlining processes and minimizing code review friction. Ensures high code quality, maintainability, and scalability. This document is the single source of truth. Applies to all new code, features, bug fixes, and refactoring across frontend (Next.js, React), backend (TypeScript, Node.js, Hono.js), database (Drizzle ORM, PostgreSQL), and infrastructure-as-code. Mandatory for all developers, QA, and technical leads.</w:t>
+      </w:r>
+    </w:p>
+    <w:p>
+      <w:pPr>
+        <w:pStyle w:val="Heading2"/>
+      </w:pPr>
+      <w:r>
+        <w:rPr>
+          <w:sz w:val="22"/>
+        </w:rPr>
+        <w:t>Guiding Principles</w:t>
       </w:r>
     </w:p>
     <w:p>
@@ -46,9 +57,9 @@
       </w:pPr>
       <w:r>
         <w:rPr>
-          <w:sz w:val="20"/>
+          <w:sz w:val="22"/>
         </w:rPr>
-        <w:t>Implement robust error handling for asynchronous operations using `try...catch` blocks to prevent application crashes.</w:t>
+        <w:t>Clarity.</w:t>
       </w:r>
     </w:p>
     <w:p>
@@ -57,9 +68,9 @@
       </w:pPr>
       <w:r>
         <w:rPr>
-          <w:sz w:val="20"/>
+          <w:sz w:val="22"/>
         </w:rPr>
-        <w:t>Never hardcode secrets or configuration values; use `.env` files and the `dotenv` package, accessing variables via `process.env.VARIABLE_NAME`.</w:t>
+        <w:t>Consistency.</w:t>
       </w:r>
     </w:p>
     <w:p>
@@ -68,9 +79,9 @@
       </w:pPr>
       <w:r>
         <w:rPr>
-          <w:sz w:val="20"/>
+          <w:sz w:val="22"/>
         </w:rPr>
-        <w:t>Utilize TypeScript throughout the codebase for enhanced type safety and early error detection, ensuring a strong type-first approach.</w:t>
+        <w:t>Automation-First.</w:t>
       </w:r>
     </w:p>
     <w:p>
@@ -79,9 +90,9 @@
       </w:pPr>
       <w:r>
         <w:rPr>
-          <w:sz w:val="20"/>
+          <w:sz w:val="22"/>
         </w:rPr>
-        <w:t>Prioritize security by preventing sensitive data exposure, especially when transitioning between server and client contexts.</w:t>
+        <w:t>Maintainability.</w:t>
       </w:r>
     </w:p>
     <w:p>
@@ -90,9 +101,9 @@
       </w:pPr>
       <w:r>
         <w:rPr>
-          <w:sz w:val="20"/>
+          <w:sz w:val="22"/>
         </w:rPr>
-        <w:t>Design for performance, leveraging patterns like composition and streaming where appropriate to optimize user experience.</w:t>
+        <w:t>Performance.</w:t>
       </w:r>
     </w:p>
     <w:p>
@@ -101,9 +112,20 @@
       </w:pPr>
       <w:r>
         <w:rPr>
-          <w:sz w:val="20"/>
+          <w:sz w:val="22"/>
         </w:rPr>
-        <w:t>Ensure all code is easily understandable and maintainable by future developers.</w:t>
+        <w:t>Security.</w:t>
+      </w:r>
+    </w:p>
+    <w:p>
+      <w:pPr>
+        <w:pStyle w:val="ListBullet"/>
+      </w:pPr>
+      <w:r>
+        <w:rPr>
+          <w:sz w:val="22"/>
+        </w:rPr>
+        <w:t>Accessibility.</w:t>
       </w:r>
     </w:p>
     <w:p>
@@ -112,9 +134,9 @@
       </w:pPr>
       <w:r>
         <w:rPr>
-          <w:sz w:val="20"/>
+          <w:sz w:val="22"/>
         </w:rPr>
-        <w:t>TypeScript / Node.js Standards</w:t>
+        <w:t>Baseline Style Guides</w:t>
       </w:r>
     </w:p>
     <w:p>
@@ -122,7 +144,18 @@
         <w:rPr>
           <w:sz w:val="20"/>
         </w:rPr>
-        <w:t>TypeScript is fundamental for type safety and maintainability in our backend services.</w:t>
+        <w:t>Informed by community best practices: Google TypeScript Style Guide, TypeScript Handbook, AWS TypeScript Best Practices. Internal standards take precedence.</w:t>
+      </w:r>
+    </w:p>
+    <w:p>
+      <w:pPr>
+        <w:pStyle w:val="Heading2"/>
+      </w:pPr>
+      <w:r>
+        <w:rPr>
+          <w:sz w:val="22"/>
+        </w:rPr>
+        <w:t>Code Formatting &amp; Linting</w:t>
       </w:r>
     </w:p>
     <w:p>
@@ -131,9 +164,9 @@
       </w:pPr>
       <w:r>
         <w:rPr>
-          <w:sz w:val="20"/>
+          <w:sz w:val="22"/>
         </w:rPr>
-        <w:t>Export types from backend packages (e.g., Hono app types) and import them into the frontend for type-safe client requests.</w:t>
+        <w:t>Prettier: Mandated formatter (semi: true, trailingComma: "all", singleQuote: true, printWidth: 120).</w:t>
       </w:r>
     </w:p>
     <w:p>
@@ -142,9 +175,9 @@
       </w:pPr>
       <w:r>
         <w:rPr>
-          <w:sz w:val="20"/>
+          <w:sz w:val="22"/>
         </w:rPr>
-        <w:t>Configure `tsconfig.json` for internal monorepo packages with `"verbatimModuleSyntax": true`, `"allowImportingTsExtensions": true`, `"rewriteRelativeImportExtensions": true`, and `NodeNext` module resolution.</w:t>
+        <w:t>ESLint: For TypeScript/React, must run. Uses eslint-plugin-import, eslint-plugin-react.</w:t>
       </w:r>
     </w:p>
     <w:p>
@@ -153,9 +186,9 @@
       </w:pPr>
       <w:r>
         <w:rPr>
-          <w:sz w:val="20"/>
+          <w:sz w:val="22"/>
         </w:rPr>
-        <w:t>Use `"noEmit": true` for internal packages that do not require compiled output.</w:t>
+        <w:t>Pre-commit Hooks: Recommended (Husky, lint-staged) for local format, lint, tests.</w:t>
       </w:r>
     </w:p>
     <w:p>
@@ -164,9 +197,9 @@
       </w:pPr>
       <w:r>
         <w:rPr>
-          <w:sz w:val="20"/>
+          <w:sz w:val="22"/>
         </w:rPr>
-        <w:t>For TypeScript Project References, set `composite: true` in `tsconfig.json`.</w:t>
+        <w:t>CI Integration: CI builds fail on formatting/linting errors.</w:t>
       </w:r>
     </w:p>
     <w:p>
@@ -175,9 +208,20 @@
       </w:pPr>
       <w:r>
         <w:rPr>
-          <w:sz w:val="20"/>
+          <w:sz w:val="22"/>
         </w:rPr>
-        <w:t>Build API endpoints using Hono.js, leveraging its `env()` adapter for secure environment variable access within route handlers.</w:t>
+        <w:t>Editor Configuration: Enable 'format on save'.</w:t>
+      </w:r>
+    </w:p>
+    <w:p>
+      <w:pPr>
+        <w:pStyle w:val="Heading2"/>
+      </w:pPr>
+      <w:r>
+        <w:rPr>
+          <w:sz w:val="22"/>
+        </w:rPr>
+        <w:t>TypeScript Standards</w:t>
       </w:r>
     </w:p>
     <w:p>
@@ -186,9 +230,9 @@
       </w:pPr>
       <w:r>
         <w:rPr>
-          <w:sz w:val="20"/>
+          <w:sz w:val="22"/>
         </w:rPr>
-        <w:t>Implement API versioning using `/api/v1`, `/api/v2` in routes to manage breaking changes effectively.</w:t>
+        <w:t>Strict Mode: Enable strict: true in tsconfig.json.</w:t>
       </w:r>
     </w:p>
     <w:p>
@@ -197,9 +241,31 @@
       </w:pPr>
       <w:r>
         <w:rPr>
-          <w:sz w:val="20"/>
+          <w:sz w:val="22"/>
         </w:rPr>
-        <w:t>Generate live, interactive API documentation using Swagger, adding JSDoc comments to routes for auto-generation.</w:t>
+        <w:t>Type-safe APIs: Export types from backend for frontend; utilize tRPC.</w:t>
+      </w:r>
+    </w:p>
+    <w:p>
+      <w:pPr>
+        <w:pStyle w:val="ListBullet"/>
+      </w:pPr>
+      <w:r>
+        <w:rPr>
+          <w:sz w:val="22"/>
+        </w:rPr>
+        <w:t>Monorepo Type Sharing: Shared configs/types in packages/.</w:t>
+      </w:r>
+    </w:p>
+    <w:p>
+      <w:pPr>
+        <w:pStyle w:val="ListBullet"/>
+      </w:pPr>
+      <w:r>
+        <w:rPr>
+          <w:sz w:val="22"/>
+        </w:rPr>
+        <w:t>Compiler Options: Configure tsconfig.json with "verbatimModuleSyntax": true, "allowImportingTsExtensions": true, "rewriteRelativeImportExtensions": true. Use NodeNext module resolution.</w:t>
       </w:r>
     </w:p>
     <w:p>
@@ -208,17 +274,9 @@
       </w:pPr>
       <w:r>
         <w:rPr>
-          <w:sz w:val="20"/>
+          <w:sz w:val="22"/>
         </w:rPr>
-        <w:t>React / Next.js Standards</w:t>
-      </w:r>
-    </w:p>
-    <w:p>
-      <w:r>
-        <w:rPr>
-          <w:sz w:val="20"/>
-        </w:rPr>
-        <w:t>Next.js App Router features are central to our frontend and API development.</w:t>
+        <w:t>Monorepo Structure &amp; Imports</w:t>
       </w:r>
     </w:p>
     <w:p>
@@ -227,9 +285,9 @@
       </w:pPr>
       <w:r>
         <w:rPr>
-          <w:sz w:val="20"/>
+          <w:sz w:val="22"/>
         </w:rPr>
-        <w:t>Default to Server Components for backend logic, direct database access, and to prevent sensitive data exposure.</w:t>
+        <w:t>Directory Structure: apps/, libs/, packages/.</w:t>
       </w:r>
     </w:p>
     <w:p>
@@ -238,9 +296,9 @@
       </w:pPr>
       <w:r>
         <w:rPr>
-          <w:sz w:val="20"/>
+          <w:sz w:val="22"/>
         </w:rPr>
-        <w:t>Use Client Components (`"use client";`) only when browser APIs, event handlers, or React state/effects are required.</w:t>
+        <w:t>Package Boundaries: Avoid deep relative imports; use shared packages.</w:t>
       </w:r>
     </w:p>
     <w:p>
@@ -249,9 +307,20 @@
       </w:pPr>
       <w:r>
         <w:rPr>
-          <w:sz w:val="20"/>
+          <w:sz w:val="22"/>
         </w:rPr>
-        <w:t>Render Server Components within Client Components to minimize client-side JavaScript.</w:t>
+        <w:t>Import Rules: npm workspaces. Internal package.json points directly to source files. Prettier with @trivago/prettier-plugin-sort-imports for import ordering.</w:t>
+      </w:r>
+    </w:p>
+    <w:p>
+      <w:pPr>
+        <w:pStyle w:val="Heading2"/>
+      </w:pPr>
+      <w:r>
+        <w:rPr>
+          <w:sz w:val="22"/>
+        </w:rPr>
+        <w:t>Database Standards (Drizzle ORM &amp; PostgreSQL)</w:t>
       </w:r>
     </w:p>
     <w:p>
@@ -260,9 +329,9 @@
       </w:pPr>
       <w:r>
         <w:rPr>
-          <w:sz w:val="20"/>
+          <w:sz w:val="22"/>
         </w:rPr>
-        <w:t>Leverage `Suspense` boundaries and `loading.js` for progressive rendering and improved perceived performance.</w:t>
+        <w:t>Drizzle Configuration: drizzle.config.ts with strict: true, verbose: true, out directory, dialect, schema path, dbCredentials (DATABASE_URL).</w:t>
       </w:r>
     </w:p>
     <w:p>
@@ -271,9 +340,9 @@
       </w:pPr>
       <w:r>
         <w:rPr>
-          <w:sz w:val="20"/>
+          <w:sz w:val="22"/>
         </w:rPr>
-        <w:t>Utilize Server Actions (`'use server'`) for mutations and form submissions, callable directly from Client Components.</w:t>
+        <w:t>Schema Definition: Type-safe schemas in TypeScript files are source of truth.</w:t>
       </w:r>
     </w:p>
     <w:p>
@@ -282,9 +351,9 @@
       </w:pPr>
       <w:r>
         <w:rPr>
-          <w:sz w:val="20"/>
+          <w:sz w:val="22"/>
         </w:rPr>
-        <w:t>Employ the typed, composable Metadata API for managing `&lt;head&gt;` elements.</w:t>
+        <w:t>Migrations: Generate with drizzle-kit generate, apply programmatically. Must be backward-compatible.</w:t>
       </w:r>
     </w:p>
     <w:p>
@@ -293,9 +362,9 @@
       </w:pPr>
       <w:r>
         <w:rPr>
-          <w:sz w:val="20"/>
+          <w:sz w:val="22"/>
         </w:rPr>
-        <w:t>Implement caching strategies at four layers: Request Memoization, Data Cache, Full Route Cache, and Router Cache.</w:t>
+        <w:t>Querying: Write type-safe queries.</w:t>
       </w:r>
     </w:p>
     <w:p>
@@ -304,9 +373,9 @@
       </w:pPr>
       <w:r>
         <w:rPr>
-          <w:sz w:val="20"/>
+          <w:sz w:val="22"/>
         </w:rPr>
-        <w:t>Use `error.tsx` files at each route segment for granular error handling.</w:t>
+        <w:t>Raw SQL Policy: Permissible for highly optimized operations, requiring thorough review.</w:t>
       </w:r>
     </w:p>
     <w:p>
@@ -315,9 +384,9 @@
       </w:pPr>
       <w:r>
         <w:rPr>
-          <w:sz w:val="20"/>
+          <w:sz w:val="22"/>
         </w:rPr>
-        <w:t>Utilize React's taint APIs (`taintObjectReference`, `taintUniqueValue`) with `experimental.taint: true` to prevent sensitive data exposure.</w:t>
+        <w:t>Seeding: Implement scripts.</w:t>
       </w:r>
     </w:p>
     <w:p>
@@ -326,9 +395,20 @@
       </w:pPr>
       <w:r>
         <w:rPr>
-          <w:sz w:val="20"/>
+          <w:sz w:val="22"/>
         </w:rPr>
-        <w:t>Adopt React 19 hooks (`use()`, `useOptimistic()`, `useActionState()`, `useFormStatus()`) and React 18 hooks (`useDeferredValue()`, `useTransition()`) for improved UI responsiveness and data handling.</w:t>
+        <w:t>Neon Connection: Use @neondatabase/serverless for serverless, pg Pool for Node.js.</w:t>
+      </w:r>
+    </w:p>
+    <w:p>
+      <w:pPr>
+        <w:pStyle w:val="Heading2"/>
+      </w:pPr>
+      <w:r>
+        <w:rPr>
+          <w:sz w:val="22"/>
+        </w:rPr>
+        <w:t>Frontend Code Standards (Next.js &amp; React)</w:t>
       </w:r>
     </w:p>
     <w:p>
@@ -337,9 +417,9 @@
       </w:pPr>
       <w:r>
         <w:rPr>
-          <w:sz w:val="20"/>
+          <w:sz w:val="22"/>
         </w:rPr>
-        <w:t>Differentiate between static and dynamic data fetching, using Next.js's `fetch` API with `revalidate` or `cache: 'no-store'`.</w:t>
+        <w:t>Component Structure &amp; Naming: Components, hooks, tests in same directory. PascalCase for components, camelCase for hooks.</w:t>
       </w:r>
     </w:p>
     <w:p>
@@ -348,9 +428,9 @@
       </w:pPr>
       <w:r>
         <w:rPr>
-          <w:sz w:val="20"/>
+          <w:sz w:val="22"/>
         </w:rPr>
-        <w:t>Use Tailwind CSS for utility-first styling and consider `shadcn/ui` for customizable components. Avoid inline styling.</w:t>
+        <w:t>Data Fetching: Differentiate static/dynamic. Use Next.js fetch for server-side caching.</w:t>
       </w:r>
     </w:p>
     <w:p>
@@ -359,9 +439,9 @@
       </w:pPr>
       <w:r>
         <w:rPr>
-          <w:sz w:val="20"/>
+          <w:sz w:val="22"/>
         </w:rPr>
-        <w:t>Implement form handling with React Hook Form and Zod for schema-based validation.</w:t>
+        <w:t>Accessibility: Write accessible components (semantic HTML, ARIA).</w:t>
       </w:r>
     </w:p>
     <w:p>
@@ -370,9 +450,42 @@
       </w:pPr>
       <w:r>
         <w:rPr>
-          <w:sz w:val="20"/>
+          <w:sz w:val="22"/>
         </w:rPr>
-        <w:t>Utilize Auth.js for authentication, configuring `jwt` for stateless session management.</w:t>
+        <w:t>React Server Components (RSC): Default for backend logic, database access, sensitive data.</w:t>
+      </w:r>
+    </w:p>
+    <w:p>
+      <w:pPr>
+        <w:pStyle w:val="ListBullet"/>
+      </w:pPr>
+      <w:r>
+        <w:rPr>
+          <w:sz w:val="22"/>
+        </w:rPr>
+        <w:t>Client Components: Use 'use client'; for browser APIs, event handlers, state/effects.</w:t>
+      </w:r>
+    </w:p>
+    <w:p>
+      <w:pPr>
+        <w:pStyle w:val="ListBullet"/>
+      </w:pPr>
+      <w:r>
+        <w:rPr>
+          <w:sz w:val="22"/>
+        </w:rPr>
+        <w:t>Server Actions: Use for mutations/form submissions.</w:t>
+      </w:r>
+    </w:p>
+    <w:p>
+      <w:pPr>
+        <w:pStyle w:val="ListBullet"/>
+      </w:pPr>
+      <w:r>
+        <w:rPr>
+          <w:sz w:val="22"/>
+        </w:rPr>
+        <w:t>Styling: Tailwind CSS; consider shadcn/ui. Avoid inline styling.</w:t>
       </w:r>
     </w:p>
     <w:p>
@@ -381,17 +494,9 @@
       </w:pPr>
       <w:r>
         <w:rPr>
-          <w:sz w:val="20"/>
+          <w:sz w:val="22"/>
         </w:rPr>
-        <w:t>Database &amp; ORM Standards</w:t>
-      </w:r>
-    </w:p>
-    <w:p>
-      <w:r>
-        <w:rPr>
-          <w:sz w:val="20"/>
-        </w:rPr>
-        <w:t>Drizzle ORM with Neon-hosted PostgreSQL ensures type-safe and efficient database interactions.</w:t>
+        <w:t>API Standards</w:t>
       </w:r>
     </w:p>
     <w:p>
@@ -400,9 +505,9 @@
       </w:pPr>
       <w:r>
         <w:rPr>
-          <w:sz w:val="20"/>
+          <w:sz w:val="22"/>
         </w:rPr>
-        <w:t>Define database schemas in TypeScript files as the single source of truth, leveraging Drizzle's type-safe schema definition language (`pgTable`, `serial`, `text`, `integer`, `timestamp`, `references`).</w:t>
+        <w:t>Versioning: Implement /api/v1, /api/v2 for breaking changes.</w:t>
       </w:r>
     </w:p>
     <w:p>
@@ -411,9 +516,9 @@
       </w:pPr>
       <w:r>
         <w:rPr>
-          <w:sz w:val="20"/>
+          <w:sz w:val="22"/>
         </w:rPr>
-        <w:t>Configure `drizzle.config.ts` with `strict: true`, `verbose: true`, an `out` directory for migrations, the `dialect` (postgresql), `schema` path, and `dbCredentials` including `DATABASE_URL`.</w:t>
+        <w:t>Documentation: Generate live, interactive API documentation using Swagger. JSDoc comments on routes auto-generate documentation.</w:t>
       </w:r>
     </w:p>
     <w:p>
@@ -422,9 +527,20 @@
       </w:pPr>
       <w:r>
         <w:rPr>
-          <w:sz w:val="20"/>
+          <w:sz w:val="22"/>
         </w:rPr>
-        <w:t>Use a `Pool` from `pg` for database connections in Node.js environments; for Neon serverless, use `@neondatabase/serverless` and the `neon()` function.</w:t>
+        <w:t>Error Handling: Implement robust try...catch for async operations and granular error.tsx files. Ensure consistent error response formats.</w:t>
+      </w:r>
+    </w:p>
+    <w:p>
+      <w:pPr>
+        <w:pStyle w:val="Heading2"/>
+      </w:pPr>
+      <w:r>
+        <w:rPr>
+          <w:sz w:val="22"/>
+        </w:rPr>
+        <w:t>Testing Standards</w:t>
       </w:r>
     </w:p>
     <w:p>
@@ -433,9 +549,9 @@
       </w:pPr>
       <w:r>
         <w:rPr>
-          <w:sz w:val="20"/>
+          <w:sz w:val="22"/>
         </w:rPr>
-        <w:t>Generate migrations using `drizzle-kit generate` and apply them programmatically via `migrate(db, { migrationsFolder: 'drizzle' })` or `drizzle-kit push`.</w:t>
+        <w:t>TDD &amp; Principles: Embrace TDD for all new features/bug fixes.</w:t>
       </w:r>
     </w:p>
     <w:p>
@@ -444,9 +560,9 @@
       </w:pPr>
       <w:r>
         <w:rPr>
-          <w:sz w:val="20"/>
+          <w:sz w:val="22"/>
         </w:rPr>
-        <w:t>Maintain migrations within a shared library in the monorepo and execute them as part of a backend service's startup routine.</w:t>
+        <w:t>Tools: React Testing Library for frontend, Jest/Vitest for backend.</w:t>
       </w:r>
     </w:p>
     <w:p>
@@ -455,9 +571,9 @@
       </w:pPr>
       <w:r>
         <w:rPr>
-          <w:sz w:val="20"/>
+          <w:sz w:val="22"/>
         </w:rPr>
-        <w:t>Write type-safe database queries using Drizzle's SQL-like syntax (e.g., `db.select().from(users)`).</w:t>
+        <w:t>Naming Conventions: Tests in same directory as code, .test.ts/.test.tsx suffixes.</w:t>
       </w:r>
     </w:p>
     <w:p>
@@ -466,9 +582,9 @@
       </w:pPr>
       <w:r>
         <w:rPr>
-          <w:sz w:val="20"/>
+          <w:sz w:val="22"/>
         </w:rPr>
-        <w:t>Implement seeding scripts using `db.insert(tableName).values([...])` to populate initial data.</w:t>
+        <w:t>New Features/Bug Fixes: Must include comprehensive tests.</w:t>
       </w:r>
     </w:p>
     <w:p>
@@ -477,9 +593,9 @@
       </w:pPr>
       <w:r>
         <w:rPr>
-          <w:sz w:val="20"/>
+          <w:sz w:val="22"/>
         </w:rPr>
-        <w:t>Use the direct (non-pooled) database connection string from Neon for running migrations, and pooled connection strings for application runtime.</w:t>
+        <w:t>CI Integration: Tests must run in CI and pass before merge.</w:t>
       </w:r>
     </w:p>
     <w:p>
@@ -488,9 +604,9 @@
       </w:pPr>
       <w:r>
         <w:rPr>
-          <w:sz w:val="20"/>
+          <w:sz w:val="22"/>
         </w:rPr>
-        <w:t>Leverage Drizzle's built-in Zod validators for schema validation.</w:t>
+        <w:t>Code Coverage: Maintain explicit project-level targets (e.g., 80%) enforced in CI.</w:t>
       </w:r>
     </w:p>
     <w:p>
@@ -499,9 +615,9 @@
       </w:pPr>
       <w:r>
         <w:rPr>
-          <w:sz w:val="20"/>
+          <w:sz w:val="22"/>
         </w:rPr>
-        <w:t>Manage local PostgreSQL instances using Docker Compose for development.</w:t>
+        <w:t>Guidelines: Prioritize user behavior, not implementation details. Mock API calls using MSW. Ensure tests are independent and readable.</w:t>
       </w:r>
     </w:p>
     <w:p>
@@ -510,17 +626,9 @@
       </w:pPr>
       <w:r>
         <w:rPr>
-          <w:sz w:val="20"/>
+          <w:sz w:val="22"/>
         </w:rPr>
-        <w:t>Testing Standards</w:t>
-      </w:r>
-    </w:p>
-    <w:p>
-      <w:r>
-        <w:rPr>
-          <w:sz w:val="20"/>
-        </w:rPr>
-        <w:t>A robust testing strategy is critical for code quality and reliability.</w:t>
+        <w:t>Documentation Standards</w:t>
       </w:r>
     </w:p>
     <w:p>
@@ -529,9 +637,9 @@
       </w:pPr>
       <w:r>
         <w:rPr>
-          <w:sz w:val="20"/>
+          <w:sz w:val="22"/>
         </w:rPr>
-        <w:t>Adopt Test-Driven Development (TDD): write focused, minimal failing tests before implementing functionality, following the Red-Green-Refactor cycle.</w:t>
+        <w:t>Self-documenting Code: Prioritize over excessive comments.</w:t>
       </w:r>
     </w:p>
     <w:p>
@@ -540,9 +648,9 @@
       </w:pPr>
       <w:r>
         <w:rPr>
-          <w:sz w:val="20"/>
+          <w:sz w:val="22"/>
         </w:rPr>
-        <w:t>Utilize React Testing Library to test component behavior from a user's perspective, interacting with DOM nodes.</w:t>
+        <w:t>When to Comment: For complex algorithms, non-obvious logic, workarounds, or "why" decisions.</w:t>
       </w:r>
     </w:p>
     <w:p>
@@ -551,9 +659,9 @@
       </w:pPr>
       <w:r>
         <w:rPr>
-          <w:sz w:val="20"/>
+          <w:sz w:val="22"/>
         </w:rPr>
-        <w:t>Prioritize accessible queries like `getByRole`, `getByLabelText`, `getByText` over `getByTestId`.</w:t>
+        <w:t>Updating Documentation: All documentation must be updated in the same PR as related code changes.</w:t>
       </w:r>
     </w:p>
     <w:p>
@@ -562,9 +670,20 @@
       </w:pPr>
       <w:r>
         <w:rPr>
-          <w:sz w:val="20"/>
+          <w:sz w:val="22"/>
         </w:rPr>
-        <w:t>Use Jest or Vitest as the primary testing framework, configured with `jsdom` for a browser-like environment and `@testing-library/jest-dom` for custom matchers.</w:t>
+        <w:t>API Documentation: Mandate standards for API documentation, including endpoints, schemas, and exported APIs using JSDoc.</w:t>
+      </w:r>
+    </w:p>
+    <w:p>
+      <w:pPr>
+        <w:pStyle w:val="Heading2"/>
+      </w:pPr>
+      <w:r>
+        <w:rPr>
+          <w:sz w:val="22"/>
+        </w:rPr>
+        <w:t>Version Control &amp; Collaboration</w:t>
       </w:r>
     </w:p>
     <w:p>
@@ -573,9 +692,9 @@
       </w:pPr>
       <w:r>
         <w:rPr>
-          <w:sz w:val="20"/>
+          <w:sz w:val="22"/>
         </w:rPr>
-        <w:t>Break down features into small, testable units, writing unit tests for individual components/functions and integration tests for interactions.</w:t>
+        <w:t>Branch Naming: Descriptive, incorporating ticket/issue ID (e.g., feature/JIRA-123-add-profile).</w:t>
       </w:r>
     </w:p>
     <w:p>
@@ -584,9 +703,9 @@
       </w:pPr>
       <w:r>
         <w:rPr>
-          <w:sz w:val="20"/>
+          <w:sz w:val="22"/>
         </w:rPr>
-        <w:t>Use `renderHook` from `@testing-library/react-hooks` for testing custom React hooks.</w:t>
+        <w:t>Commit Messages: Conventional Commits: type(scope): subject (e.g., feat(client): add user profile). Link to relevant issue (e.g., Fixes #123). Recommend atomic commits.</w:t>
       </w:r>
     </w:p>
     <w:p>
@@ -595,9 +714,9 @@
       </w:pPr>
       <w:r>
         <w:rPr>
-          <w:sz w:val="20"/>
+          <w:sz w:val="22"/>
         </w:rPr>
-        <w:t>Mock API calls using Mock Service Worker (MSW) for deterministic and isolated testing.</w:t>
+        <w:t>PR Titles: Follow Conventional Commits.</w:t>
       </w:r>
     </w:p>
     <w:p>
@@ -606,9 +725,9 @@
       </w:pPr>
       <w:r>
         <w:rPr>
-          <w:sz w:val="20"/>
+          <w:sz w:val="22"/>
         </w:rPr>
-        <w:t>For React Server Components, focus on integration tests and mock server-side data fetching.</w:t>
+        <w:t>PR Size: Aim for PRs under 400 lines.</w:t>
       </w:r>
     </w:p>
     <w:p>
@@ -617,9 +736,9 @@
       </w:pPr>
       <w:r>
         <w:rPr>
-          <w:sz w:val="20"/>
+          <w:sz w:val="22"/>
         </w:rPr>
-        <w:t>Use snapshot tests judiciously for static UI elements, avoiding them for highly dynamic components.</w:t>
+        <w:t>Large PRs: Split, require design docs, or special reviewers.</w:t>
       </w:r>
     </w:p>
     <w:p>
@@ -628,9 +747,9 @@
       </w:pPr>
       <w:r>
         <w:rPr>
-          <w:sz w:val="20"/>
+          <w:sz w:val="22"/>
         </w:rPr>
-        <w:t>Simulate user interactions using `fireEvent` and `user-event` from React Testing Library.</w:t>
+        <w:t>PR Description: Include context, screenshots, testing notes, risks.</w:t>
       </w:r>
     </w:p>
     <w:p>
@@ -639,9 +758,9 @@
       </w:pPr>
       <w:r>
         <w:rPr>
-          <w:sz w:val="20"/>
+          <w:sz w:val="22"/>
         </w:rPr>
-        <w:t>Ensure tests are independent and do not rely on execution order.</w:t>
+        <w:t>Review Turnaround: Goals for review turnaround (e.g., 24 business hours).</w:t>
       </w:r>
     </w:p>
     <w:p>
@@ -650,9 +769,9 @@
       </w:pPr>
       <w:r>
         <w:rPr>
-          <w:sz w:val="20"/>
+          <w:sz w:val="22"/>
         </w:rPr>
-        <w:t>Integrate TDD into CI/CD pipelines to automate test execution, parallelize tests, and enforce code coverage thresholds.</w:t>
+        <w:t>Direct Pushes: Policy against direct pushes to main.</w:t>
       </w:r>
     </w:p>
     <w:p>
@@ -661,9 +780,9 @@
       </w:pPr>
       <w:r>
         <w:rPr>
-          <w:sz w:val="20"/>
+          <w:sz w:val="22"/>
         </w:rPr>
-        <w:t>Test `getServerSideProps` and `getStaticProps` in Next.js to validate data fetching.</w:t>
+        <w:t>Conflict Resolution: Resolve disagreements via discussion, pair programming, or tech lead.</w:t>
       </w:r>
     </w:p>
     <w:p>
@@ -672,9 +791,9 @@
       </w:pPr>
       <w:r>
         <w:rPr>
-          <w:sz w:val="20"/>
+          <w:sz w:val="22"/>
         </w:rPr>
-        <w:t>Place tests in the same directory as the code they test, with an exception for Next.js `pages` (`__tests__/pages`).</w:t>
+        <w:t>Squash-and-Merge: Recommended for clean Git history.</w:t>
       </w:r>
     </w:p>
     <w:p>
@@ -683,17 +802,9 @@
       </w:pPr>
       <w:r>
         <w:rPr>
-          <w:sz w:val="20"/>
+          <w:sz w:val="22"/>
         </w:rPr>
-        <w:t>Code Formatting &amp; Tooling</w:t>
-      </w:r>
-    </w:p>
-    <w:p>
-      <w:r>
-        <w:rPr>
-          <w:sz w:val="20"/>
-        </w:rPr>
-        <w:t>Consistent code formatting and robust tooling are essential for maintainability and efficient reviews.</w:t>
+        <w:t>Continuous Integration (CI)</w:t>
       </w:r>
     </w:p>
     <w:p>
@@ -702,9 +813,9 @@
       </w:pPr>
       <w:r>
         <w:rPr>
-          <w:sz w:val="20"/>
+          <w:sz w:val="22"/>
         </w:rPr>
-        <w:t>Utilize Prettier for consistent code formatting across the entire project. Configure with `semi: true`, `trailingComma: "all"`, `singleQuote: true`, and `printWidth: 120`.</w:t>
+        <w:t>Main Branch Always Green: main branch must always be green and deployable.</w:t>
       </w:r>
     </w:p>
     <w:p>
@@ -713,9 +824,9 @@
       </w:pPr>
       <w:r>
         <w:rPr>
-          <w:sz w:val="20"/>
+          <w:sz w:val="22"/>
         </w:rPr>
-        <w:t>Integrate ESLint with Prettier (using `eslint-config-prettier`) to enforce code style rules and catch errors. Extend shared base configurations and allow for workspace-specific overrides.</w:t>
+        <w:t>Automated Checks: CI builds automatically run all tests, linting, and formatting on every PR. Builds fail if checks don't pass.</w:t>
       </w:r>
     </w:p>
     <w:p>
@@ -724,9 +835,9 @@
       </w:pPr>
       <w:r>
         <w:rPr>
-          <w:sz w:val="20"/>
+          <w:sz w:val="22"/>
         </w:rPr>
-        <w:t>Use `lint-staged` and Husky for pre-commit hooks to automatically enforce formatting and linting before commits.</w:t>
+        <w:t>Turborepo for Efficiency: Leverage Turborepo with --affected flag to optimize CI build times.</w:t>
       </w:r>
     </w:p>
     <w:p>
@@ -735,9 +846,9 @@
       </w:pPr>
       <w:r>
         <w:rPr>
-          <w:sz w:val="20"/>
+          <w:sz w:val="22"/>
         </w:rPr>
-        <w:t>Structure the monorepo with top-level directories: `apps/` for runnable applications, `libs/` for shared runtime code, and `packages/` for tooling and shared configurations.</w:t>
+        <w:t>Deploy-on-Merge: Implement automated deployments after successful CI and reviews.</w:t>
       </w:r>
     </w:p>
     <w:p>
@@ -746,9 +857,20 @@
       </w:pPr>
       <w:r>
         <w:rPr>
-          <w:sz w:val="20"/>
+          <w:sz w:val="22"/>
         </w:rPr>
-        <w:t>Leverage npm workspaces for dependency resolution between internal packages and root-level script execution.</w:t>
+        <w:t>Parallelize Tests: Parallelize tests in CI/CD.</w:t>
+      </w:r>
+    </w:p>
+    <w:p>
+      <w:pPr>
+        <w:pStyle w:val="Heading2"/>
+      </w:pPr>
+      <w:r>
+        <w:rPr>
+          <w:sz w:val="22"/>
+        </w:rPr>
+        <w:t>Security &amp; Environment Variables</w:t>
       </w:r>
     </w:p>
     <w:p>
@@ -757,9 +879,9 @@
       </w:pPr>
       <w:r>
         <w:rPr>
-          <w:sz w:val="20"/>
+          <w:sz w:val="22"/>
         </w:rPr>
-        <w:t>Create shared configurations in the `packages/` directory (e.g., `@example/eslint-config`, `@example/prettier-config`, `@example/tsconfig`).</w:t>
+        <w:t>Secrets Management: Use environment variables for all secrets; never commit. Use .env files locally, excluded by .gitignore.</w:t>
       </w:r>
     </w:p>
     <w:p>
@@ -768,9 +890,9 @@
       </w:pPr>
       <w:r>
         <w:rPr>
-          <w:sz w:val="20"/>
+          <w:sz w:val="22"/>
         </w:rPr>
-        <w:t>Adopt Turborepo for efficient CI, using the `--affected` flag to run tasks only on changed packages and `turbo prune` for optimized Docker images.</w:t>
+        <w:t>Environment Variable Validation: Employ Zod for type-safe validation, leveraging @t3-oss/env-nextjs.</w:t>
       </w:r>
     </w:p>
     <w:p>
@@ -779,9 +901,9 @@
       </w:pPr>
       <w:r>
         <w:rPr>
-          <w:sz w:val="20"/>
+          <w:sz w:val="22"/>
         </w:rPr>
-        <w:t>Configure Prettier with `@trivago/prettier-plugin-sort-imports` for consistent import sorting.</w:t>
+        <w:t>Taint APIs: Utilize React's taint APIs (taintObjectReference, taintUniqueValue) and experimental.taint: true in next.config.js to prevent sensitive data exposure.</w:t>
       </w:r>
     </w:p>
     <w:p>
@@ -790,9 +912,9 @@
       </w:pPr>
       <w:r>
         <w:rPr>
-          <w:sz w:val="20"/>
+          <w:sz w:val="22"/>
         </w:rPr>
-        <w:t>Use Zod for type-safe environment variable validation, leveraging `@t3-oss/env-nextjs` and `eslint-plugin-n` to disallow direct `process.env` usage.</w:t>
+        <w:t>ESLint Plugin: Configure eslint-plugin-n to disallow direct process.env usage.</w:t>
       </w:r>
     </w:p>
     <w:p>
@@ -801,17 +923,9 @@
       </w:pPr>
       <w:r>
         <w:rPr>
-          <w:sz w:val="20"/>
+          <w:sz w:val="22"/>
         </w:rPr>
-        <w:t>Documentation Standards</w:t>
-      </w:r>
-    </w:p>
-    <w:p>
-      <w:r>
-        <w:rPr>
-          <w:sz w:val="20"/>
-        </w:rPr>
-        <w:t>Clear and concise documentation facilitates understanding, onboarding, and maintenance.</w:t>
+        <w:t>Change Management</w:t>
       </w:r>
     </w:p>
     <w:p>
@@ -820,9 +934,9 @@
       </w:pPr>
       <w:r>
         <w:rPr>
-          <w:sz w:val="20"/>
+          <w:sz w:val="22"/>
         </w:rPr>
-        <w:t>Add JSDoc comments to API routes and functions to enable auto-generation of API documentation via Swagger.</w:t>
+        <w:t>Living Document: Team actively contributes and maintains standards.</w:t>
       </w:r>
     </w:p>
     <w:p>
@@ -831,9 +945,9 @@
       </w:pPr>
       <w:r>
         <w:rPr>
-          <w:sz w:val="20"/>
+          <w:sz w:val="22"/>
         </w:rPr>
-        <w:t>Write clear and informative Pull Request descriptions that explain "What changed," "Why," and "How to review." Include relevant context such as links to tickets, screenshots for UI changes, and deployment notes.</w:t>
+        <w:t>Contribution &amp; Maintenance: Proposed changes via PRs to standards repository. Require review/approval by VP of Engineering or lead.</w:t>
       </w:r>
     </w:p>
     <w:p>
@@ -842,9 +956,20 @@
       </w:pPr>
       <w:r>
         <w:rPr>
-          <w:sz w:val="20"/>
+          <w:sz w:val="22"/>
         </w:rPr>
-        <w:t>Document new environment variables or feature flags required for changes, ensuring they are clearly communicated.</w:t>
+        <w:t>Review Cadence: Standards formally reviewed/updated quarterly or per major release cycle.</w:t>
+      </w:r>
+    </w:p>
+    <w:p>
+      <w:pPr>
+        <w:pStyle w:val="Heading2"/>
+      </w:pPr>
+      <w:r>
+        <w:rPr>
+          <w:sz w:val="22"/>
+        </w:rPr>
+        <w:t>Rollout Plan &amp; Next Steps</w:t>
       </w:r>
     </w:p>
     <w:p>
@@ -853,9 +978,9 @@
       </w:pPr>
       <w:r>
         <w:rPr>
-          <w:sz w:val="20"/>
+          <w:sz w:val="22"/>
         </w:rPr>
-        <w:t>Maintain up-to-date README files for each application and shared library within the monorepo, detailing setup, usage, and contribution guidelines.</w:t>
+        <w:t>VP Review: Document undergoes initial review by VP of Engineering for final approval.</w:t>
       </w:r>
     </w:p>
     <w:p>
@@ -864,9 +989,9 @@
       </w:pPr>
       <w:r>
         <w:rPr>
-          <w:sz w:val="20"/>
+          <w:sz w:val="22"/>
         </w:rPr>
-        <w:t>Use inline comments judiciously for complex or non-obvious logic, explaining the intent rather than merely restating the code.</w:t>
+        <w:t>Staged Rollout: Following approval, standards rolled out in stages, starting with new projects.</w:t>
       </w:r>
     </w:p>
     <w:p>
@@ -875,9 +1000,20 @@
       </w:pPr>
       <w:r>
         <w:rPr>
-          <w:sz w:val="20"/>
+          <w:sz w:val="22"/>
         </w:rPr>
-        <w:t>Ensure all public APIs and interfaces are well-documented with TypeScript types and JSDoc comments.</w:t>
+        <w:t>Training &amp; Workshops: Dedicated sessions will familiarize developers.</w:t>
+      </w:r>
+    </w:p>
+    <w:p>
+      <w:pPr>
+        <w:pStyle w:val="ListBullet"/>
+      </w:pPr>
+      <w:r>
+        <w:rPr>
+          <w:sz w:val="22"/>
+        </w:rPr>
+        <w:t>Feedback Loop: Open feedback channel established during rollout.</w:t>
       </w:r>
     </w:p>
     <w:p>
@@ -886,17 +1022,9 @@
       </w:pPr>
       <w:r>
         <w:rPr>
-          <w:sz w:val="20"/>
+          <w:sz w:val="22"/>
         </w:rPr>
-        <w:t>PR, Branch Naming &amp; Commit Message Guidelines</w:t>
-      </w:r>
-    </w:p>
-    <w:p>
-      <w:r>
-        <w:rPr>
-          <w:sz w:val="20"/>
-        </w:rPr>
-        <w:t>Consistent naming and messaging improve Git history readability and automation.</w:t>
+        <w:t>Glossary</w:t>
       </w:r>
     </w:p>
     <w:p>
@@ -905,9 +1033,9 @@
       </w:pPr>
       <w:r>
         <w:rPr>
-          <w:sz w:val="20"/>
+          <w:sz w:val="22"/>
         </w:rPr>
-        <w:t>Adhere to the Conventional Commits specification for commit messages and PR titles: `&lt;type&gt;[optional scope]: &lt;description&gt;`.</w:t>
+        <w:t>API: Application Programming Interface.</w:t>
       </w:r>
     </w:p>
     <w:p>
@@ -916,9 +1044,9 @@
       </w:pPr>
       <w:r>
         <w:rPr>
-          <w:sz w:val="20"/>
+          <w:sz w:val="22"/>
         </w:rPr>
-        <w:t>Use standard commit types: `feat` (new feature), `fix` (bug fix), `refactor` (code change that neither fixes a bug nor adds a feature), `docs` (documentation only changes), `test` (adding missing tests or correcting existing tests), `chore` (routine tasks), `perf` (performance improvements), `build` (build system changes), `ci` (CI configuration changes), `revert` (reverts a previous commit).</w:t>
+        <w:t>CI: Continuous Integration.</w:t>
       </w:r>
     </w:p>
     <w:p>
@@ -927,9 +1055,9 @@
       </w:pPr>
       <w:r>
         <w:rPr>
-          <w:sz w:val="20"/>
+          <w:sz w:val="22"/>
         </w:rPr>
-        <w:t>Use scopes (e.g., `feat(api):`, `fix(client):`) to indicate the affected part of the monorepo.</w:t>
+        <w:t>ORM: Object-Relational Mapper.</w:t>
       </w:r>
     </w:p>
     <w:p>
@@ -938,9 +1066,9 @@
       </w:pPr>
       <w:r>
         <w:rPr>
-          <w:sz w:val="20"/>
+          <w:sz w:val="22"/>
         </w:rPr>
-        <w:t>Keep commit messages concise, ideally within 50-90 characters for the subject line.</w:t>
+        <w:t>PR: Pull Request.</w:t>
       </w:r>
     </w:p>
     <w:p>
@@ -949,9 +1077,9 @@
       </w:pPr>
       <w:r>
         <w:rPr>
-          <w:sz w:val="20"/>
+          <w:sz w:val="22"/>
         </w:rPr>
-        <w:t>For bug fixes, reference the issue number in the commit message or PR description (e.g., "Fixes #123").</w:t>
+        <w:t>RSC: React Server Components.</w:t>
       </w:r>
     </w:p>
     <w:p>
@@ -960,9 +1088,9 @@
       </w:pPr>
       <w:r>
         <w:rPr>
-          <w:sz w:val="20"/>
+          <w:sz w:val="22"/>
         </w:rPr>
-        <w:t>Break down large features or fixes into smaller, atomic Pull Requests (PRs), aiming for "1 PR = 1 feature/fix".</w:t>
+        <w:t>SLA: Service Level Agreement.</w:t>
       </w:r>
     </w:p>
     <w:p>
@@ -971,9 +1099,9 @@
       </w:pPr>
       <w:r>
         <w:rPr>
-          <w:sz w:val="20"/>
+          <w:sz w:val="22"/>
         </w:rPr>
-        <w:t>For complex features, utilize stacked PRs where each branch targets the previous one.</w:t>
+        <w:t>TDD: Test-Driven Development.</w:t>
       </w:r>
     </w:p>
     <w:p>
@@ -982,9 +1110,9 @@
       </w:pPr>
       <w:r>
         <w:rPr>
-          <w:sz w:val="20"/>
+          <w:sz w:val="22"/>
         </w:rPr>
-        <w:t>Use descriptive branch names with clear prefixes (e.g., `feature/add-user-auth`, `hotfix/fix-login-bug`, `integration/db-migration`).</w:t>
+        <w:t>tRPC: Type-safe Remote Procedure Call.</w:t>
       </w:r>
     </w:p>
     <w:p>
@@ -993,9 +1121,9 @@
       </w:pPr>
       <w:r>
         <w:rPr>
-          <w:sz w:val="20"/>
+          <w:sz w:val="22"/>
         </w:rPr>
-        <w:t>Use `git rebase -i` to clean up commit history before merging or releasing, ensuring a clean, linear history.</w:t>
+        <w:t>MSW: Mock Service Worker.</w:t>
       </w:r>
     </w:p>
     <w:p>
@@ -1004,160 +1132,9 @@
       </w:pPr>
       <w:r>
         <w:rPr>
-          <w:sz w:val="20"/>
+          <w:sz w:val="22"/>
         </w:rPr>
-        <w:t>Utilize PR templates to standardize descriptions.</w:t>
-      </w:r>
-    </w:p>
-    <w:p>
-      <w:pPr>
-        <w:pStyle w:val="Heading2"/>
-      </w:pPr>
-      <w:r>
-        <w:rPr>
-          <w:sz w:val="20"/>
-        </w:rPr>
-        <w:t>Review Process &amp; Enforcement</w:t>
-      </w:r>
-    </w:p>
-    <w:p>
-      <w:r>
-        <w:rPr>
-          <w:sz w:val="20"/>
-        </w:rPr>
-        <w:t>A structured review process ensures code quality and efficient delivery.</w:t>
-      </w:r>
-    </w:p>
-    <w:p>
-      <w:pPr>
-        <w:pStyle w:val="ListBullet"/>
-      </w:pPr>
-      <w:r>
-        <w:rPr>
-          <w:sz w:val="20"/>
-        </w:rPr>
-        <w:t>Implement automated checks (CI, linting, type checking) that run on every PR before merging.</w:t>
-      </w:r>
-    </w:p>
-    <w:p>
-      <w:pPr>
-        <w:pStyle w:val="ListBullet"/>
-      </w:pPr>
-      <w:r>
-        <w:rPr>
-          <w:sz w:val="20"/>
-        </w:rPr>
-        <w:t>Configure branch protection rules for critical branches (e.g., `main`) to require reviews and passing status checks.</w:t>
-      </w:r>
-    </w:p>
-    <w:p>
-      <w:pPr>
-        <w:pStyle w:val="ListBullet"/>
-      </w:pPr>
-      <w:r>
-        <w:rPr>
-          <w:sz w:val="20"/>
-        </w:rPr>
-        <w:t>Enforce a maximum PR size limit (e.g., 400 lines of change) to encourage smaller, more manageable reviews.</w:t>
-      </w:r>
-    </w:p>
-    <w:p>
-      <w:pPr>
-        <w:pStyle w:val="ListBullet"/>
-      </w:pPr>
-      <w:r>
-        <w:rPr>
-          <w:sz w:val="20"/>
-        </w:rPr>
-        <w:t>Establish team agreements or Service Level Agreements (SLAs) for PR turnaround times (e.g., time to first review, time to merge) to prevent delays.</w:t>
-      </w:r>
-    </w:p>
-    <w:p>
-      <w:pPr>
-        <w:pStyle w:val="ListBullet"/>
-      </w:pPr>
-      <w:r>
-        <w:rPr>
-          <w:sz w:val="20"/>
-        </w:rPr>
-        <w:t>Separate refactoring efforts from feature development into distinct PRs to improve review clarity and reduce deployment risk.</w:t>
-      </w:r>
-    </w:p>
-    <w:p>
-      <w:pPr>
-        <w:pStyle w:val="ListBullet"/>
-      </w:pPr>
-      <w:r>
-        <w:rPr>
-          <w:sz w:val="20"/>
-        </w:rPr>
-        <w:t>Track PR health metrics such as time to first review, time to merge, PR size, and review comments per PR.</w:t>
-      </w:r>
-    </w:p>
-    <w:p>
-      <w:pPr>
-        <w:pStyle w:val="ListBullet"/>
-      </w:pPr>
-      <w:r>
-        <w:rPr>
-          <w:sz w:val="20"/>
-        </w:rPr>
-        <w:t>When reviewing code, prioritize correctness, security, architecture, and maintainability over subjective style preferences.</w:t>
-      </w:r>
-    </w:p>
-    <w:p>
-      <w:pPr>
-        <w:pStyle w:val="ListBullet"/>
-      </w:pPr>
-      <w:r>
-        <w:rPr>
-          <w:sz w:val="20"/>
-        </w:rPr>
-        <w:t>Use prefixes like `blocking:`, `nit:`, `question:`, `suggestion:` in code review comments to clarify intent.</w:t>
-      </w:r>
-    </w:p>
-    <w:p>
-      <w:pPr>
-        <w:pStyle w:val="ListBullet"/>
-      </w:pPr>
-      <w:r>
-        <w:rPr>
-          <w:sz w:val="20"/>
-        </w:rPr>
-        <w:t>Consider using AI-assisted code review tools as a first pass to catch mechanical issues before human review.</w:t>
-      </w:r>
-    </w:p>
-    <w:p>
-      <w:pPr>
-        <w:pStyle w:val="ListBullet"/>
-      </w:pPr>
-      <w:r>
-        <w:rPr>
-          <w:sz w:val="20"/>
-        </w:rPr>
-        <w:t>Implement a deploy-on-merge pattern for automated deployments to production after successful CI checks and code reviews.</w:t>
-      </w:r>
-    </w:p>
-    <w:p>
-      <w:pPr>
-        <w:pStyle w:val="ListBullet"/>
-      </w:pPr>
-      <w:r>
-        <w:rPr>
-          <w:sz w:val="20"/>
-        </w:rPr>
-        <w:t>Utilize staging environments for an additional verification step before production deployment.</w:t>
-      </w:r>
-    </w:p>
-    <w:p>
-      <w:pPr>
-        <w:pStyle w:val="ListBullet"/>
-      </w:pPr>
-      <w:r>
-        <w:rPr>
-          <w:sz w:val="20"/>
-        </w:rPr>
-        <w:t>Ensure database migrations are backward-compatible and consider rollback paths.</w:t>
+        <w:t>Zod: TypeScript-first schema declaration and validation library.</w:t>
       </w:r>
     </w:p>
     <w:sectPr>

</xml_diff>